<commit_message>
Update documentation to draft
</commit_message>
<xml_diff>
--- a/Documentation/Full Draft.docx
+++ b/Documentation/Full Draft.docx
@@ -1858,6 +1858,13 @@
         </w:rPr>
         <w:t>. The prevalence is differed to region and country, reported approximately 10-20% in Western countries and 5-12% in Eastern countries at some time</w:t>
       </w:r>
+      <w:r>
+        <w:rPr>
+          <w:rFonts w:ascii="Calibri" w:hAnsi="Calibri" w:cs="Calibri"/>
+          <w:color w:val="000000"/>
+        </w:rPr>
+        <w:t xml:space="preserve"> </w:t>
+      </w:r>
       <w:sdt>
         <w:sdtPr>
           <w:rPr>
@@ -2125,7 +2132,7 @@
           <w:rFonts w:ascii="Calibri" w:hAnsi="Calibri" w:cs="Calibri"/>
           <w:color w:val="000000"/>
         </w:rPr>
-        <w:t xml:space="preserve">. After diagnosing, treatment is proceeded while the most preferred method currently is cholecystectomy. Despite this treatment process is formal and effectively, but it also comes with disadvantages, such as the patients may have issues with fat digestion as their gallbladder is removed along with the gallstone </w:t>
+        <w:t xml:space="preserve">. After diagnosing, treatment is proceeded while the most preferred method currently is cholecystectomy. Despite this treatment process is formal and effective, but it also comes with disadvantages, such as the patients may have issues with fat digestion as their gallbladder is removed along with the gallstone </w:t>
       </w:r>
       <w:sdt>
         <w:sdtPr>
@@ -2486,146 +2493,6 @@
         </w:rPr>
         <w:t xml:space="preserve"> .</w:t>
       </w:r>
-    </w:p>
-    <w:p>
-      <w:pPr>
-        <w:jc w:val="both"/>
-        <w:rPr>
-          <w:rFonts w:ascii="Calibri" w:hAnsi="Calibri" w:cs="Calibri"/>
-          <w:color w:val="000000"/>
-        </w:rPr>
-      </w:pPr>
-    </w:p>
-    <w:p>
-      <w:pPr>
-        <w:jc w:val="both"/>
-        <w:rPr>
-          <w:rFonts w:ascii="Calibri" w:hAnsi="Calibri" w:cs="Calibri"/>
-          <w:color w:val="000000"/>
-        </w:rPr>
-      </w:pPr>
-      <w:r>
-        <w:rPr>
-          <w:rFonts w:ascii="Calibri" w:hAnsi="Calibri" w:cs="Calibri"/>
-          <w:color w:val="000000"/>
-        </w:rPr>
-        <w:t xml:space="preserve">There are many types of machine learning techniques, a basic classification concept is based on whether the data is labelled (dependant variable to predict included in training dataset) or not, normally classified into 3 types of machine learning, which are supervised learning (labelled data are utilized for training), unsupervised learning (unlabelled data are utilized for training data) and reinforcement learning (training based on trial and error, intends to achieve a better score) </w:t>
-      </w:r>
-      <w:sdt>
-        <w:sdtPr>
-          <w:rPr>
-            <w:rFonts w:ascii="Calibri" w:hAnsi="Calibri" w:cs="Calibri"/>
-            <w:color w:val="000000"/>
-          </w:rPr>
-          <w:tag w:val="MENDELEY_CITATION_v3_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"/>
-          <w:id w:val="-963971642"/>
-          <w:placeholder>
-            <w:docPart w:val="C314108D6C9F48D0A8366FD8E9DCAF40"/>
-          </w:placeholder>
-        </w:sdtPr>
-        <w:sdtContent>
-          <w:r>
-            <w:rPr>
-              <w:rFonts w:ascii="Calibri" w:eastAsia="Times New Roman" w:hAnsi="Calibri" w:cs="Calibri"/>
-              <w:color w:val="000000"/>
-            </w:rPr>
-            <w:t>(</w:t>
-          </w:r>
-          <w:proofErr w:type="spellStart"/>
-          <w:r>
-            <w:rPr>
-              <w:rFonts w:ascii="Calibri" w:eastAsia="Times New Roman" w:hAnsi="Calibri" w:cs="Calibri"/>
-              <w:color w:val="000000"/>
-            </w:rPr>
-            <w:t>Mahalle</w:t>
-          </w:r>
-          <w:proofErr w:type="spellEnd"/>
-          <w:r>
-            <w:rPr>
-              <w:rFonts w:ascii="Calibri" w:eastAsia="Times New Roman" w:hAnsi="Calibri" w:cs="Calibri"/>
-              <w:color w:val="000000"/>
-            </w:rPr>
-            <w:t xml:space="preserve"> </w:t>
-          </w:r>
-          <w:r>
-            <w:rPr>
-              <w:rFonts w:ascii="Calibri" w:eastAsia="Times New Roman" w:hAnsi="Calibri" w:cs="Calibri"/>
-              <w:i/>
-              <w:iCs/>
-              <w:color w:val="000000"/>
-            </w:rPr>
-            <w:t>et al.</w:t>
-          </w:r>
-          <w:r>
-            <w:rPr>
-              <w:rFonts w:ascii="Calibri" w:eastAsia="Times New Roman" w:hAnsi="Calibri" w:cs="Calibri"/>
-              <w:color w:val="000000"/>
-            </w:rPr>
-            <w:t>, 2025)</w:t>
-          </w:r>
-        </w:sdtContent>
-      </w:sdt>
-      <w:r>
-        <w:rPr>
-          <w:rFonts w:ascii="Calibri" w:hAnsi="Calibri" w:cs="Calibri"/>
-          <w:color w:val="000000"/>
-        </w:rPr>
-        <w:t>. The tasks performed vary depending on the type, for example, supervised learning generally used to perform regression (predicting the outcome numeric values) and classification task (classifying result belongs to which classes), while unsupervised learning typically used to perform clustering (dividing data into different group b) and dimensionality reduction (simplifying data while preserving essential information). Differently, reinforcement learning can perform a variety of complex task with its agents across environments training, guided by policies-based rewards and punishes</w:t>
-      </w:r>
-      <w:sdt>
-        <w:sdtPr>
-          <w:rPr>
-            <w:rFonts w:ascii="Calibri" w:hAnsi="Calibri" w:cs="Calibri"/>
-            <w:color w:val="000000"/>
-          </w:rPr>
-          <w:tag w:val="MENDELEY_CITATION_v3_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"/>
-          <w:id w:val="1641771861"/>
-          <w:placeholder>
-            <w:docPart w:val="C314108D6C9F48D0A8366FD8E9DCAF40"/>
-          </w:placeholder>
-        </w:sdtPr>
-        <w:sdtContent>
-          <w:r>
-            <w:rPr>
-              <w:rFonts w:ascii="Calibri" w:eastAsia="Times New Roman" w:hAnsi="Calibri" w:cs="Calibri"/>
-              <w:color w:val="000000"/>
-            </w:rPr>
-            <w:t xml:space="preserve">(Farnham </w:t>
-          </w:r>
-          <w:r>
-            <w:rPr>
-              <w:rFonts w:ascii="Calibri" w:eastAsia="Times New Roman" w:hAnsi="Calibri" w:cs="Calibri"/>
-              <w:i/>
-              <w:iCs/>
-              <w:color w:val="000000"/>
-            </w:rPr>
-            <w:t>et al.</w:t>
-          </w:r>
-          <w:r>
-            <w:rPr>
-              <w:rFonts w:ascii="Calibri" w:eastAsia="Times New Roman" w:hAnsi="Calibri" w:cs="Calibri"/>
-              <w:color w:val="000000"/>
-            </w:rPr>
-            <w:t>, no date; Jiang, Ma and Wu, 2026)</w:t>
-          </w:r>
-        </w:sdtContent>
-      </w:sdt>
-      <w:r>
-        <w:rPr>
-          <w:rFonts w:ascii="Calibri" w:hAnsi="Calibri" w:cs="Calibri"/>
-          <w:color w:val="000000"/>
-        </w:rPr>
-        <w:t xml:space="preserve">. </w:t>
-      </w:r>
-    </w:p>
-    <w:p>
-      <w:pPr>
-        <w:rPr>
-          <w:rFonts w:ascii="Calibri" w:eastAsiaTheme="majorEastAsia" w:hAnsi="Calibri" w:cs="Calibri"/>
-          <w:color w:val="0F4761" w:themeColor="accent1" w:themeShade="BF"/>
-          <w:lang w:eastAsia="en-GB"/>
-        </w:rPr>
-      </w:pPr>
       <w:r>
         <w:rPr>
           <w:rFonts w:ascii="Calibri" w:hAnsi="Calibri" w:cs="Calibri"/>
@@ -2638,13 +2505,13 @@
       <w:pPr>
         <w:pStyle w:val="Heading1"/>
       </w:pPr>
-      <w:bookmarkStart w:id="5" w:name="_Hlk217415510"/>
-      <w:bookmarkStart w:id="6" w:name="_Toc217418631"/>
+      <w:bookmarkStart w:id="5" w:name="_Toc217418631"/>
+      <w:bookmarkStart w:id="6" w:name="_Hlk217415510"/>
       <w:r>
         <w:lastRenderedPageBreak/>
         <w:t>Literature Review</w:t>
       </w:r>
-      <w:bookmarkEnd w:id="6"/>
+      <w:bookmarkEnd w:id="5"/>
     </w:p>
     <w:p>
       <w:pPr>
@@ -2677,6 +2544,13 @@
         </w:rPr>
         <w:t>Machine learning had been utilised widely in healthcare discipline nowadays to support medical professionals’ process of diagnosing and treating, and achieve result in diagnosis precision enhancement, administrative procedures simplification and treatment regimens individualization etc</w:t>
       </w:r>
+      <w:r>
+        <w:rPr>
+          <w:rFonts w:ascii="Calibri" w:hAnsi="Calibri" w:cs="Calibri"/>
+          <w:color w:val="000000"/>
+        </w:rPr>
+        <w:t xml:space="preserve"> </w:t>
+      </w:r>
       <w:sdt>
         <w:sdtPr>
           <w:rPr>
@@ -2728,6 +2602,35 @@
           <w:color w:val="000000"/>
         </w:rPr>
         <w:t xml:space="preserve"> </w:t>
+      </w:r>
+      <w:commentRangeStart w:id="8"/>
+      <w:r>
+        <w:rPr>
+          <w:rFonts w:ascii="Calibri" w:hAnsi="Calibri" w:cs="Calibri"/>
+          <w:color w:val="000000"/>
+        </w:rPr>
+        <w:t xml:space="preserve">Notable results include </w:t>
+      </w:r>
+      <w:r>
+        <w:rPr>
+          <w:rFonts w:ascii="Calibri" w:hAnsi="Calibri" w:cs="Calibri"/>
+          <w:color w:val="000000"/>
+        </w:rPr>
+        <w:t>tumour</w:t>
+      </w:r>
+      <w:r>
+        <w:rPr>
+          <w:rFonts w:ascii="Calibri" w:hAnsi="Calibri" w:cs="Calibri"/>
+          <w:color w:val="000000"/>
+        </w:rPr>
+        <w:t xml:space="preserve"> detection and classification in oncology, treatment guidance and antimicrobial resistance monitoring in clinical microbiology, and the conversion of large-scale clinical data into actionable insights.</w:t>
+      </w:r>
+      <w:commentRangeEnd w:id="8"/>
+      <w:r>
+        <w:rPr>
+          <w:rStyle w:val="CommentReference"/>
+        </w:rPr>
+        <w:commentReference w:id="8"/>
       </w:r>
     </w:p>
     <w:p>
@@ -2751,7 +2654,36 @@
           <w:rFonts w:ascii="Calibri" w:hAnsi="Calibri" w:cs="Calibri"/>
           <w:color w:val="000000"/>
         </w:rPr>
-        <w:t>Hepatobiliary department is not excepted; in fact, there are multiple and increasingly study of corporation of machine learning (ML) or artificial intelligence (AI) in hepatobiliary related disease currently. For example, A Srivastava et al. attempted three machine learning models based on electronic health record datasets for the prediction and classification of liver diseases</w:t>
+        <w:t xml:space="preserve">Hepatobiliary department is not excepted; in fact, there are multiple and increasingly study of corporation of machine learning (ML) or artificial intelligence (AI) in hepatobiliary related disease currently. For example, </w:t>
+      </w:r>
+      <w:commentRangeStart w:id="9"/>
+      <w:r>
+        <w:rPr>
+          <w:rFonts w:ascii="Calibri" w:hAnsi="Calibri" w:cs="Calibri"/>
+          <w:color w:val="000000"/>
+        </w:rPr>
+        <w:t>A Srivastava</w:t>
+      </w:r>
+      <w:commentRangeEnd w:id="9"/>
+      <w:r>
+        <w:rPr>
+          <w:rStyle w:val="CommentReference"/>
+        </w:rPr>
+        <w:commentReference w:id="9"/>
+      </w:r>
+      <w:r>
+        <w:rPr>
+          <w:rFonts w:ascii="Calibri" w:hAnsi="Calibri" w:cs="Calibri"/>
+          <w:color w:val="000000"/>
+        </w:rPr>
+        <w:t xml:space="preserve"> et al. attempted three machine learning models based on electronic health record datasets for the prediction and classification of liver diseases</w:t>
+      </w:r>
+      <w:r>
+        <w:rPr>
+          <w:rFonts w:ascii="Calibri" w:hAnsi="Calibri" w:cs="Calibri"/>
+          <w:color w:val="000000"/>
+        </w:rPr>
+        <w:t xml:space="preserve"> </w:t>
       </w:r>
       <w:sdt>
         <w:sdtPr>
@@ -2862,11 +2794,11 @@
       <w:pPr>
         <w:pStyle w:val="Heading2"/>
       </w:pPr>
-      <w:bookmarkStart w:id="8" w:name="_Toc217418633"/>
+      <w:bookmarkStart w:id="10" w:name="_Toc217418633"/>
       <w:r>
         <w:t>Machine Learning and Gallbladder Disease</w:t>
       </w:r>
-      <w:bookmarkEnd w:id="8"/>
+      <w:bookmarkEnd w:id="10"/>
     </w:p>
     <w:p>
       <w:pPr>
@@ -3102,7 +3034,15 @@
           <w:rFonts w:ascii="Calibri" w:hAnsi="Calibri" w:cs="Calibri"/>
           <w:color w:val="000000"/>
         </w:rPr>
-        <w:t>. A model took point-of-care ultrasound (POCUS) as input for cholelithiasis and cholecystitis detection was proposed by CJ Yu et al. to assist the emergency physicians, even in remote areas</w:t>
+        <w:t xml:space="preserve">. A model took point-of-care ultrasound (POCUS) as input for cholelithiasis </w:t>
+      </w:r>
+      <w:r>
+        <w:rPr>
+          <w:rFonts w:ascii="Calibri" w:hAnsi="Calibri" w:cs="Calibri"/>
+          <w:color w:val="000000"/>
+        </w:rPr>
+        <w:lastRenderedPageBreak/>
+        <w:t>and cholecystitis detection was proposed by CJ Yu et al. to assist the emergency physicians, even in remote areas</w:t>
       </w:r>
       <w:sdt>
         <w:sdtPr>
@@ -3147,15 +3087,7 @@
           <w:rFonts w:ascii="Calibri" w:hAnsi="Calibri" w:cs="Calibri"/>
           <w:color w:val="000000"/>
         </w:rPr>
-        <w:t xml:space="preserve">. On the other hand, D Kumar et al. improved the model </w:t>
-      </w:r>
-      <w:r>
-        <w:rPr>
-          <w:rFonts w:ascii="Calibri" w:hAnsi="Calibri" w:cs="Calibri"/>
-          <w:color w:val="000000"/>
-        </w:rPr>
-        <w:lastRenderedPageBreak/>
-        <w:t xml:space="preserve">generalization by producing synthetic ultrasound images through a modified deep convolutional generative adversarial network (DCGAN) in addition. At the same time, a hybrid visual explanation method for CNN to explain model prediction was proposed to increase the reliability and explainability </w:t>
+        <w:t xml:space="preserve">. On the other hand, D Kumar et al. improved the model generalization by producing synthetic ultrasound images through a modified deep convolutional generative adversarial network (DCGAN) in addition. At the same time, a hybrid visual explanation method for CNN to explain model prediction was proposed to increase the reliability and explainability </w:t>
       </w:r>
       <w:sdt>
         <w:sdtPr>
@@ -3580,7 +3512,7 @@
           <w:rFonts w:ascii="Calibri" w:hAnsi="Calibri" w:cs="Calibri"/>
           <w:color w:val="000000"/>
         </w:rPr>
-        <w:t xml:space="preserve">Despite of more variance of models were used, the research based on laboratory data is still insufficient compared to research based on images, especially in cholelithiasis prediction. Furthermore, although there were multiple models and algorithms had been attempted, but there are still many of models haven't been utilized. In addition, there was still gap between </w:t>
+        <w:t xml:space="preserve">Despite of more variance of models were used, the research based on laboratory data is still insufficient compared to research based on images, especially in cholelithiasis prediction. </w:t>
       </w:r>
       <w:r>
         <w:rPr>
@@ -3588,10 +3520,10 @@
           <w:color w:val="000000"/>
         </w:rPr>
         <w:lastRenderedPageBreak/>
-        <w:t>the evaluation results of laboratory data-based models with images-based models, with the image-based models are generally 5~10% better compared to data-based models. This might reason by insufficient data, and laboratory data fluctuation as affected by overall body status while images-based data only focusing on region of interest. Therefore, there is still a clear need to bridge this performance gap by finding new ways to refine and optimize machine learning models that rely solely on clinical and laboratory data.</w:t>
+        <w:t>Furthermore, although there were multiple models and algorithms had been attempted, but there are still many of models haven't been utilized. In addition, there was still gap between the evaluation results of laboratory data-based models with images-based models, with the image-based models are generally 5~10% better compared to data-based models. This might reason by insufficient data, and laboratory data fluctuation as affected by overall body status while images-based data only focusing on region of interest. Therefore, there is still a clear need to bridge this performance gap by finding new ways to refine and optimize machine learning models that rely solely on clinical and laboratory data.</w:t>
       </w:r>
     </w:p>
-    <w:bookmarkEnd w:id="5"/>
+    <w:bookmarkEnd w:id="6"/>
     <w:p>
       <w:pPr>
         <w:jc w:val="both"/>
@@ -3635,12 +3567,12 @@
       <w:pPr>
         <w:pStyle w:val="Heading2"/>
       </w:pPr>
-      <w:bookmarkStart w:id="9" w:name="_Toc217418634"/>
+      <w:bookmarkStart w:id="11" w:name="_Toc217418634"/>
       <w:r>
         <w:lastRenderedPageBreak/>
         <w:t>Project Goal</w:t>
       </w:r>
-      <w:bookmarkEnd w:id="9"/>
+      <w:bookmarkEnd w:id="11"/>
     </w:p>
     <w:p>
       <w:pPr>
@@ -3653,7 +3585,31 @@
         <w:rPr>
           <w:rFonts w:ascii="Calibri" w:hAnsi="Calibri" w:cs="Calibri"/>
         </w:rPr>
-        <w:t>This project aims to design and develop a machine learning-based model capable of predicting the risk of gallstone disease using clinical and demographic data. The study further seeks to employ metaheuristic algorithms to optimise model performance, thereby improving predictive accuracy and reliability. This project will focus on the development of an optimised machine learning model for gallstone disease prediction using publicly available medical datasets. The project will include data preprocessing, feature selection, model training, evaluation, and optimisation using metaheuristic algorithms such as Artificial Bee Colony (ABC) algorithm. Excluded from the project are clinical trials, patient data collection from hospitals, and the design of new diagnostic hardware. The deliverables will include the trained models, performance evaluation metrics, comparative results before and after optimisation, and documentation of methodology.</w:t>
+        <w:t>This project aims to design and develop a machine learning-based model</w:t>
+      </w:r>
+      <w:r>
+        <w:rPr>
+          <w:rFonts w:ascii="Calibri" w:hAnsi="Calibri" w:cs="Calibri"/>
+        </w:rPr>
+        <w:t>, called Extreme Learning Machine (ELM)</w:t>
+      </w:r>
+      <w:r>
+        <w:rPr>
+          <w:rFonts w:ascii="Calibri" w:hAnsi="Calibri" w:cs="Calibri"/>
+        </w:rPr>
+        <w:t xml:space="preserve"> capable of predicting the risk of gallstone disease using clinical and demographic data. The study further seeks to employ metaheuristic algorithms to optimise model performance, thereby improving predictive accuracy and reliability. This project will focus on the development of an optimised </w:t>
+      </w:r>
+      <w:r>
+        <w:rPr>
+          <w:rFonts w:ascii="Calibri" w:hAnsi="Calibri" w:cs="Calibri"/>
+        </w:rPr>
+        <w:t>ELM</w:t>
+      </w:r>
+      <w:r>
+        <w:rPr>
+          <w:rFonts w:ascii="Calibri" w:hAnsi="Calibri" w:cs="Calibri"/>
+        </w:rPr>
+        <w:t xml:space="preserve"> for gallstone disease prediction using publicly available medical datasets. The project will include data preprocessing, feature selection, model training, evaluation, and optimisation using metaheuristic algorithms such as Artificial Bee Colony (ABC) algorithm. Excluded from the project are clinical trials, patient data collection from hospitals, and the design of new diagnostic hardware. The deliverables will include the trained models, performance evaluation metrics, comparative results before and after optimisation, and documentation of methodology.</w:t>
       </w:r>
     </w:p>
     <w:p>
@@ -3674,24 +3630,24 @@
       <w:pPr>
         <w:pStyle w:val="Heading1"/>
       </w:pPr>
-      <w:bookmarkStart w:id="10" w:name="_Hlk217416730"/>
-      <w:bookmarkStart w:id="11" w:name="_Toc217418635"/>
+      <w:bookmarkStart w:id="12" w:name="_Toc217418635"/>
+      <w:bookmarkStart w:id="13" w:name="_Hlk217416730"/>
       <w:r>
         <w:lastRenderedPageBreak/>
         <w:t>Technical Progress</w:t>
       </w:r>
-      <w:bookmarkEnd w:id="11"/>
+      <w:bookmarkEnd w:id="12"/>
     </w:p>
     <w:p>
       <w:pPr>
         <w:pStyle w:val="Heading2"/>
       </w:pPr>
-      <w:bookmarkStart w:id="12" w:name="_Toc217418636"/>
-      <w:bookmarkEnd w:id="10"/>
+      <w:bookmarkStart w:id="14" w:name="_Toc217418636"/>
+      <w:bookmarkEnd w:id="13"/>
       <w:r>
         <w:t>Dataset</w:t>
       </w:r>
-      <w:bookmarkEnd w:id="12"/>
+      <w:bookmarkEnd w:id="14"/>
     </w:p>
     <w:p>
       <w:pPr>
@@ -3773,12 +3729,12 @@
         <w:rPr>
           <w:rFonts w:ascii="Calibri" w:hAnsi="Calibri" w:cs="Calibri"/>
         </w:rPr>
+        <w:instrText xml:space="preserve"> \* MERGEFORMAT </w:instrText>
       </w:r>
       <w:r>
         <w:rPr>
           <w:rFonts w:ascii="Calibri" w:hAnsi="Calibri" w:cs="Calibri"/>
         </w:rPr>
-        <w:instrText xml:space="preserve"> \* MERGEFORMAT </w:instrText>
       </w:r>
       <w:r>
         <w:rPr>
@@ -4001,12 +3957,12 @@
         <w:rPr>
           <w:rFonts w:ascii="Calibri" w:hAnsi="Calibri" w:cs="Calibri"/>
         </w:rPr>
+        <w:instrText xml:space="preserve"> \* MERGEFORMAT </w:instrText>
       </w:r>
       <w:r>
         <w:rPr>
           <w:rFonts w:ascii="Calibri" w:hAnsi="Calibri" w:cs="Calibri"/>
         </w:rPr>
-        <w:instrText xml:space="preserve"> \* MERGEFORMAT </w:instrText>
       </w:r>
       <w:r>
         <w:rPr>
@@ -4067,7 +4023,7 @@
           <w:szCs w:val="24"/>
         </w:rPr>
       </w:pPr>
-      <w:bookmarkStart w:id="13" w:name="_Ref217403407"/>
+      <w:bookmarkStart w:id="15" w:name="_Ref217403407"/>
       <w:r>
         <w:rPr>
           <w:rFonts w:ascii="Calibri" w:hAnsi="Calibri" w:cs="Calibri"/>
@@ -4117,7 +4073,7 @@
         </w:rPr>
         <w:fldChar w:fldCharType="end"/>
       </w:r>
-      <w:bookmarkEnd w:id="13"/>
+      <w:bookmarkEnd w:id="15"/>
       <w:r>
         <w:rPr>
           <w:rFonts w:ascii="Calibri" w:hAnsi="Calibri" w:cs="Calibri"/>
@@ -13300,8 +13256,8 @@
           <w:szCs w:val="24"/>
         </w:rPr>
       </w:pPr>
-      <w:bookmarkStart w:id="14" w:name="_Ref217403892"/>
-      <w:bookmarkStart w:id="15" w:name="_Ref217411838"/>
+      <w:bookmarkStart w:id="16" w:name="_Ref217403892"/>
+      <w:bookmarkStart w:id="17" w:name="_Ref217411838"/>
       <w:r>
         <w:rPr>
           <w:rFonts w:ascii="Calibri" w:hAnsi="Calibri" w:cs="Calibri"/>
@@ -13351,7 +13307,7 @@
         </w:rPr>
         <w:fldChar w:fldCharType="end"/>
       </w:r>
-      <w:bookmarkEnd w:id="14"/>
+      <w:bookmarkEnd w:id="16"/>
       <w:r>
         <w:rPr>
           <w:rFonts w:ascii="Calibri" w:hAnsi="Calibri" w:cs="Calibri"/>
@@ -13360,7 +13316,7 @@
         </w:rPr>
         <w:t>. Statistical Information of Dataset</w:t>
       </w:r>
-      <w:bookmarkEnd w:id="15"/>
+      <w:bookmarkEnd w:id="17"/>
     </w:p>
     <w:tbl>
       <w:tblPr>
@@ -27641,12 +27597,12 @@
       <w:pPr>
         <w:pStyle w:val="Heading2"/>
       </w:pPr>
-      <w:bookmarkStart w:id="16" w:name="_Toc217418637"/>
+      <w:bookmarkStart w:id="18" w:name="_Toc217418637"/>
       <w:r>
         <w:lastRenderedPageBreak/>
         <w:t>Data Preprocessing</w:t>
       </w:r>
-      <w:bookmarkEnd w:id="16"/>
+      <w:bookmarkEnd w:id="18"/>
     </w:p>
     <w:p>
       <w:pPr>
@@ -27661,6 +27617,7 @@
         </w:rPr>
         <w:t xml:space="preserve">According to the abstract on UCI page of the dataset, additional preprocessing is generally unnecessary. However, data from </w:t>
       </w:r>
+      <w:commentRangeStart w:id="19"/>
       <w:r>
         <w:rPr>
           <w:rFonts w:ascii="Calibri" w:hAnsi="Calibri" w:cs="Calibri"/>
@@ -27677,12 +27634,12 @@
         <w:rPr>
           <w:rFonts w:ascii="Calibri" w:hAnsi="Calibri" w:cs="Calibri"/>
         </w:rPr>
+        <w:instrText xml:space="preserve"> \* MERGEFORMAT </w:instrText>
       </w:r>
       <w:r>
         <w:rPr>
           <w:rFonts w:ascii="Calibri" w:hAnsi="Calibri" w:cs="Calibri"/>
         </w:rPr>
-        <w:instrText xml:space="preserve"> \* MERGEFORMAT </w:instrText>
       </w:r>
       <w:r>
         <w:rPr>
@@ -27712,12 +27669,12 @@
         <w:rPr>
           <w:rFonts w:ascii="Calibri" w:hAnsi="Calibri" w:cs="Calibri"/>
         </w:rPr>
+        <w:instrText xml:space="preserve"> \* MERGEFORMAT </w:instrText>
       </w:r>
       <w:r>
         <w:rPr>
           <w:rFonts w:ascii="Calibri" w:hAnsi="Calibri" w:cs="Calibri"/>
         </w:rPr>
-        <w:instrText xml:space="preserve"> \* MERGEFORMAT </w:instrText>
       </w:r>
       <w:r>
         <w:rPr>
@@ -27744,11 +27701,42 @@
         </w:rPr>
         <w:fldChar w:fldCharType="end"/>
       </w:r>
+      <w:commentRangeEnd w:id="19"/>
+      <w:r>
+        <w:rPr>
+          <w:rStyle w:val="CommentReference"/>
+        </w:rPr>
+        <w:commentReference w:id="19"/>
+      </w:r>
       <w:r>
         <w:rPr>
           <w:rFonts w:ascii="Calibri" w:hAnsi="Calibri" w:cs="Calibri"/>
         </w:rPr>
-        <w:t xml:space="preserve"> showing there are some extreme high standard deviations across the columns, indicating that some columns values are containing conspicuous outliers. Furthermore, there are different data requirements for different machine learning models. Hence, the outliers were handled by capping techniques, which mean the data located outside the boundaries are replaced with the boundary values. Afterward, the data were processed with scaling as Extreme Learning Machine is sensitive to this. Data scaling was performed by Min-Max Scaler, which scaled the data into the range of 0 to 1 according to their position over the range in its columns.</w:t>
+        <w:t xml:space="preserve"> show</w:t>
+      </w:r>
+      <w:r>
+        <w:rPr>
+          <w:rFonts w:ascii="Calibri" w:hAnsi="Calibri" w:cs="Calibri"/>
+        </w:rPr>
+        <w:t>s that</w:t>
+      </w:r>
+      <w:r>
+        <w:rPr>
+          <w:rFonts w:ascii="Calibri" w:hAnsi="Calibri" w:cs="Calibri"/>
+        </w:rPr>
+        <w:t xml:space="preserve"> there are some extreme high standard deviations across the columns, indicating that some columns values are containing conspicuous outliers. Furthermore, there are different data requirements for different machine learning models. Hence, the outliers were handled by capping techniques, which mean the data located outside the boundaries are replaced with the boundary values. Afterward, the data were processed with scaling as </w:t>
+      </w:r>
+      <w:r>
+        <w:rPr>
+          <w:rFonts w:ascii="Calibri" w:hAnsi="Calibri" w:cs="Calibri"/>
+        </w:rPr>
+        <w:t>ELM</w:t>
+      </w:r>
+      <w:r>
+        <w:rPr>
+          <w:rFonts w:ascii="Calibri" w:hAnsi="Calibri" w:cs="Calibri"/>
+        </w:rPr>
+        <w:t xml:space="preserve"> is sensitive to this. Data scaling was performed by Min-Max Scaler, which scaled the data into the range of 0 to 1 according to their position over the range in its columns.</w:t>
       </w:r>
     </w:p>
     <w:p>
@@ -27763,11 +27751,11 @@
       <w:pPr>
         <w:pStyle w:val="Heading2"/>
       </w:pPr>
-      <w:bookmarkStart w:id="17" w:name="_Toc217418638"/>
+      <w:bookmarkStart w:id="20" w:name="_Toc217418638"/>
       <w:r>
         <w:t>Model Implementation</w:t>
       </w:r>
-      <w:bookmarkEnd w:id="17"/>
+      <w:bookmarkEnd w:id="20"/>
     </w:p>
     <w:p>
       <w:pPr>
@@ -27796,6 +27784,62 @@
         </w:rPr>
         <w:t xml:space="preserve"> was imported from scikit-elm library, and the dataset was partitioned into 80% training and 20% testing sets. By using a straightforward processing pipeline, the model was trained and evaluated without cross-validation, which achieved 0.78 accuracy and 0.78 F1-score without cross validation. However, the primary objective of this project is the development of a custom-built, optimized ELM model, which is still in early stages, and is detailed in plan of remaining works section.</w:t>
       </w:r>
+      <w:r>
+        <w:rPr>
+          <w:rFonts w:ascii="Calibri" w:hAnsi="Calibri" w:cs="Calibri"/>
+        </w:rPr>
+        <w:t xml:space="preserve"> </w:t>
+      </w:r>
+      <w:r>
+        <w:rPr>
+          <w:rFonts w:ascii="Calibri" w:hAnsi="Calibri" w:cs="Calibri"/>
+        </w:rPr>
+        <w:t xml:space="preserve">More detailed information will be documented in the methodology section of the final report, which is planned </w:t>
+      </w:r>
+      <w:r>
+        <w:rPr>
+          <w:rFonts w:ascii="Calibri" w:hAnsi="Calibri" w:cs="Calibri"/>
+        </w:rPr>
+        <w:t>in</w:t>
+      </w:r>
+      <w:r>
+        <w:rPr>
+          <w:rFonts w:ascii="Calibri" w:hAnsi="Calibri" w:cs="Calibri"/>
+        </w:rPr>
+        <w:t xml:space="preserve"> </w:t>
+      </w:r>
+      <w:r>
+        <w:rPr>
+          <w:rFonts w:ascii="Calibri" w:hAnsi="Calibri" w:cs="Calibri"/>
+        </w:rPr>
+        <w:t>remaining</w:t>
+      </w:r>
+      <w:r>
+        <w:rPr>
+          <w:rFonts w:ascii="Calibri" w:hAnsi="Calibri" w:cs="Calibri"/>
+        </w:rPr>
+        <w:t xml:space="preserve"> </w:t>
+      </w:r>
+      <w:commentRangeStart w:id="21"/>
+      <w:r>
+        <w:rPr>
+          <w:rFonts w:ascii="Calibri" w:hAnsi="Calibri" w:cs="Calibri"/>
+        </w:rPr>
+        <w:t>work</w:t>
+      </w:r>
+      <w:commentRangeEnd w:id="21"/>
+      <w:r>
+        <w:rPr>
+          <w:rStyle w:val="CommentReference"/>
+        </w:rPr>
+        <w:commentReference w:id="21"/>
+      </w:r>
+      <w:r>
+        <w:rPr>
+          <w:rFonts w:ascii="Calibri" w:hAnsi="Calibri" w:cs="Calibri"/>
+        </w:rPr>
+        <w:t>.</w:t>
+      </w:r>
     </w:p>
     <w:p>
       <w:pPr>
@@ -27822,12 +27866,12 @@
       <w:pPr>
         <w:pStyle w:val="Heading1"/>
       </w:pPr>
-      <w:bookmarkStart w:id="18" w:name="_Toc217418639"/>
+      <w:bookmarkStart w:id="22" w:name="_Toc217418639"/>
       <w:r>
         <w:lastRenderedPageBreak/>
         <w:t>Plan of Remaining Work</w:t>
       </w:r>
-      <w:bookmarkEnd w:id="18"/>
+      <w:bookmarkEnd w:id="22"/>
     </w:p>
     <w:p>
       <w:pPr>
@@ -27857,7 +27901,7 @@
                     <pic:cNvPicPr/>
                   </pic:nvPicPr>
                   <pic:blipFill>
-                    <a:blip r:embed="rId6">
+                    <a:blip r:embed="rId10">
                       <a:extLst>
                         <a:ext uri="{28A0092B-C50C-407E-A947-70E740481C1C}">
                           <a14:useLocalDpi xmlns:a14="http://schemas.microsoft.com/office/drawing/2010/main" val="0"/>
@@ -27893,7 +27937,7 @@
           <w:szCs w:val="24"/>
         </w:rPr>
       </w:pPr>
-      <w:bookmarkStart w:id="19" w:name="_Ref217416590"/>
+      <w:bookmarkStart w:id="23" w:name="_Ref217416590"/>
       <w:r>
         <w:rPr>
           <w:rFonts w:ascii="Calibri" w:hAnsi="Calibri" w:cs="Calibri"/>
@@ -27943,7 +27987,7 @@
         </w:rPr>
         <w:fldChar w:fldCharType="end"/>
       </w:r>
-      <w:bookmarkEnd w:id="19"/>
+      <w:bookmarkEnd w:id="23"/>
       <w:r>
         <w:rPr>
           <w:rFonts w:ascii="Calibri" w:hAnsi="Calibri" w:cs="Calibri"/>
@@ -28043,7 +28087,7 @@
                     <pic:cNvPicPr/>
                   </pic:nvPicPr>
                   <pic:blipFill>
-                    <a:blip r:embed="rId7">
+                    <a:blip r:embed="rId11">
                       <a:extLst>
                         <a:ext uri="{28A0092B-C50C-407E-A947-70E740481C1C}">
                           <a14:useLocalDpi xmlns:a14="http://schemas.microsoft.com/office/drawing/2010/main" val="0"/>
@@ -28079,7 +28123,7 @@
           <w:szCs w:val="24"/>
         </w:rPr>
       </w:pPr>
-      <w:bookmarkStart w:id="20" w:name="_Ref217417408"/>
+      <w:bookmarkStart w:id="24" w:name="_Ref217417408"/>
       <w:r>
         <w:rPr>
           <w:rFonts w:ascii="Calibri" w:hAnsi="Calibri" w:cs="Calibri"/>
@@ -28129,7 +28173,7 @@
         </w:rPr>
         <w:fldChar w:fldCharType="end"/>
       </w:r>
-      <w:bookmarkEnd w:id="20"/>
+      <w:bookmarkEnd w:id="24"/>
       <w:r>
         <w:rPr>
           <w:rFonts w:ascii="Calibri" w:hAnsi="Calibri" w:cs="Calibri"/>
@@ -28205,12 +28249,12 @@
       <w:pPr>
         <w:pStyle w:val="Heading1"/>
       </w:pPr>
-      <w:bookmarkStart w:id="21" w:name="_Toc217418640"/>
+      <w:bookmarkStart w:id="25" w:name="_Toc217418640"/>
       <w:r>
         <w:lastRenderedPageBreak/>
         <w:t>Reference</w:t>
       </w:r>
-      <w:bookmarkEnd w:id="21"/>
+      <w:bookmarkEnd w:id="25"/>
     </w:p>
     <w:sdt>
       <w:sdtPr>
@@ -29940,6 +29984,136 @@
     </w:sectPr>
   </w:body>
 </w:document>
+</file>
+
+<file path=word/comments.xml><?xml version="1.0" encoding="utf-8"?>
+<w:comments xmlns:wpc="http://schemas.microsoft.com/office/word/2010/wordprocessingCanvas" xmlns:cx="http://schemas.microsoft.com/office/drawing/2014/chartex" xmlns:cx1="http://schemas.microsoft.com/office/drawing/2015/9/8/chartex" xmlns:cx2="http://schemas.microsoft.com/office/drawing/2015/10/21/chartex" xmlns:cx3="http://schemas.microsoft.com/office/drawing/2016/5/9/chartex" xmlns:cx4="http://schemas.microsoft.com/office/drawing/2016/5/10/chartex" xmlns:cx5="http://schemas.microsoft.com/office/drawing/2016/5/11/chartex" xmlns:cx6="http://schemas.microsoft.com/office/drawing/2016/5/12/chartex" xmlns:cx7="http://schemas.microsoft.com/office/drawing/2016/5/13/chartex" xmlns:cx8="http://schemas.microsoft.com/office/drawing/2016/5/14/chartex" xmlns:mc="http://schemas.openxmlformats.org/markup-compatibility/2006" xmlns:aink="http://schemas.microsoft.com/office/drawing/2016/ink" xmlns:am3d="http://schemas.microsoft.com/office/drawing/2017/model3d" xmlns:o="urn:schemas-microsoft-com:office:office" xmlns:oel="http://schemas.microsoft.com/office/2019/extlst" xmlns:r="http://schemas.openxmlformats.org/officeDocument/2006/relationships" xmlns:m="http://schemas.openxmlformats.org/officeDocument/2006/math" xmlns:v="urn:schemas-microsoft-com:vml" xmlns:wp14="http://schemas.microsoft.com/office/word/2010/wordprocessingDrawing" xmlns:wp="http://schemas.openxmlformats.org/drawingml/2006/wordprocessingDrawing" xmlns:w10="urn:schemas-microsoft-com:office:word" xmlns:w="http://schemas.openxmlformats.org/wordprocessingml/2006/main" xmlns:w14="http://schemas.microsoft.com/office/word/2010/wordml" xmlns:w15="http://schemas.microsoft.com/office/word/2012/wordml" xmlns:w16cex="http://schemas.microsoft.com/office/word/2018/wordml/cex" xmlns:w16cid="http://schemas.microsoft.com/office/word/2016/wordml/cid" xmlns:w16="http://schemas.microsoft.com/office/word/2018/wordml" xmlns:w16du="http://schemas.microsoft.com/office/word/2023/wordml/word16du" xmlns:w16sdtdh="http://schemas.microsoft.com/office/word/2020/wordml/sdtdatahash" xmlns:w16sdtfl="http://schemas.microsoft.com/office/word/2024/wordml/sdtformatlock" xmlns:w16se="http://schemas.microsoft.com/office/word/2015/wordml/symex" xmlns:wpg="http://schemas.microsoft.com/office/word/2010/wordprocessingGroup" xmlns:wpi="http://schemas.microsoft.com/office/word/2010/wordprocessingInk" xmlns:wne="http://schemas.microsoft.com/office/word/2006/wordml" xmlns:wps="http://schemas.microsoft.com/office/word/2010/wordprocessingShape" mc:Ignorable="w14 w15 w16se w16cid w16 w16cex w16sdtdh w16sdtfl w16du wp14">
+  <w:comment w:id="8" w:author="YouQuan Neu (yqn1e23)" w:date="2025-12-25T20:08:00Z" w:initials="YN">
+    <w:p>
+      <w:pPr>
+        <w:pStyle w:val="CommentText"/>
+      </w:pPr>
+      <w:r>
+        <w:rPr>
+          <w:rStyle w:val="CommentReference"/>
+        </w:rPr>
+        <w:annotationRef/>
+      </w:r>
+      <w:r>
+        <w:rPr>
+          <w:lang w:val="en-SG"/>
+        </w:rPr>
+        <w:t>Add a line as it looks too empty</w:t>
+      </w:r>
+    </w:p>
+  </w:comment>
+  <w:comment w:id="9" w:author="YouQuan Neu (yqn1e23)" w:date="2025-12-25T19:07:00Z" w:initials="YN">
+    <w:p>
+      <w:pPr>
+        <w:pStyle w:val="CommentText"/>
+      </w:pPr>
+      <w:r>
+        <w:rPr>
+          <w:rStyle w:val="CommentReference"/>
+        </w:rPr>
+        <w:annotationRef/>
+      </w:r>
+      <w:r>
+        <w:rPr>
+          <w:lang w:val="en-SG"/>
+        </w:rPr>
+        <w:t>This ‘A’ is part of the author name.</w:t>
+      </w:r>
+    </w:p>
+    <w:p>
+      <w:pPr>
+        <w:pStyle w:val="CommentText"/>
+      </w:pPr>
+      <w:r>
+        <w:rPr>
+          <w:lang w:val="en-SG"/>
+        </w:rPr>
+        <w:t>Delete it, keep it or make it full name?</w:t>
+      </w:r>
+    </w:p>
+  </w:comment>
+  <w:comment w:id="19" w:author="YouQuan Neu (yqn1e23)" w:date="2025-12-25T19:13:00Z" w:initials="YN">
+    <w:p>
+      <w:pPr>
+        <w:pStyle w:val="CommentText"/>
+      </w:pPr>
+      <w:r>
+        <w:rPr>
+          <w:rStyle w:val="CommentReference"/>
+        </w:rPr>
+        <w:annotationRef/>
+      </w:r>
+      <w:r>
+        <w:rPr>
+          <w:lang w:val="en-SG"/>
+        </w:rPr>
+        <w:t>The full name shown in PDF is printing issue;</w:t>
+      </w:r>
+    </w:p>
+    <w:p>
+      <w:pPr>
+        <w:pStyle w:val="CommentText"/>
+      </w:pPr>
+      <w:r>
+        <w:rPr>
+          <w:lang w:val="en-SG"/>
+        </w:rPr>
+        <w:t>Showing was changed to shows that</w:t>
+      </w:r>
+    </w:p>
+  </w:comment>
+  <w:comment w:id="21" w:author="YouQuan Neu (yqn1e23)" w:date="2025-12-25T19:17:00Z" w:initials="YN">
+    <w:p>
+      <w:pPr>
+        <w:pStyle w:val="CommentText"/>
+      </w:pPr>
+      <w:r>
+        <w:rPr>
+          <w:rStyle w:val="CommentReference"/>
+        </w:rPr>
+        <w:annotationRef/>
+      </w:r>
+      <w:r>
+        <w:rPr>
+          <w:lang w:val="en-SG"/>
+        </w:rPr>
+        <w:t>Add a remark which will be done in remaining work.</w:t>
+      </w:r>
+    </w:p>
+  </w:comment>
+</w:comments>
+</file>
+
+<file path=word/commentsExtended.xml><?xml version="1.0" encoding="utf-8"?>
+<w15:commentsEx xmlns:wpc="http://schemas.microsoft.com/office/word/2010/wordprocessingCanvas" xmlns:cx="http://schemas.microsoft.com/office/drawing/2014/chartex" xmlns:cx1="http://schemas.microsoft.com/office/drawing/2015/9/8/chartex" xmlns:cx2="http://schemas.microsoft.com/office/drawing/2015/10/21/chartex" xmlns:cx3="http://schemas.microsoft.com/office/drawing/2016/5/9/chartex" xmlns:cx4="http://schemas.microsoft.com/office/drawing/2016/5/10/chartex" xmlns:cx5="http://schemas.microsoft.com/office/drawing/2016/5/11/chartex" xmlns:cx6="http://schemas.microsoft.com/office/drawing/2016/5/12/chartex" xmlns:cx7="http://schemas.microsoft.com/office/drawing/2016/5/13/chartex" xmlns:cx8="http://schemas.microsoft.com/office/drawing/2016/5/14/chartex" xmlns:mc="http://schemas.openxmlformats.org/markup-compatibility/2006" xmlns:aink="http://schemas.microsoft.com/office/drawing/2016/ink" xmlns:am3d="http://schemas.microsoft.com/office/drawing/2017/model3d" xmlns:o="urn:schemas-microsoft-com:office:office" xmlns:oel="http://schemas.microsoft.com/office/2019/extlst" xmlns:r="http://schemas.openxmlformats.org/officeDocument/2006/relationships" xmlns:m="http://schemas.openxmlformats.org/officeDocument/2006/math" xmlns:v="urn:schemas-microsoft-com:vml" xmlns:wp14="http://schemas.microsoft.com/office/word/2010/wordprocessingDrawing" xmlns:wp="http://schemas.openxmlformats.org/drawingml/2006/wordprocessingDrawing" xmlns:w10="urn:schemas-microsoft-com:office:word" xmlns:w="http://schemas.openxmlformats.org/wordprocessingml/2006/main" xmlns:w14="http://schemas.microsoft.com/office/word/2010/wordml" xmlns:w15="http://schemas.microsoft.com/office/word/2012/wordml" xmlns:w16cex="http://schemas.microsoft.com/office/word/2018/wordml/cex" xmlns:w16cid="http://schemas.microsoft.com/office/word/2016/wordml/cid" xmlns:w16="http://schemas.microsoft.com/office/word/2018/wordml" xmlns:w16du="http://schemas.microsoft.com/office/word/2023/wordml/word16du" xmlns:w16sdtdh="http://schemas.microsoft.com/office/word/2020/wordml/sdtdatahash" xmlns:w16sdtfl="http://schemas.microsoft.com/office/word/2024/wordml/sdtformatlock" xmlns:w16se="http://schemas.microsoft.com/office/word/2015/wordml/symex" xmlns:wpg="http://schemas.microsoft.com/office/word/2010/wordprocessingGroup" xmlns:wpi="http://schemas.microsoft.com/office/word/2010/wordprocessingInk" xmlns:wne="http://schemas.microsoft.com/office/word/2006/wordml" xmlns:wps="http://schemas.microsoft.com/office/word/2010/wordprocessingShape" mc:Ignorable="w14 w15 w16se w16cid w16 w16cex w16sdtdh w16sdtfl w16du wp14">
+  <w15:commentEx w15:paraId="590A92B5" w15:done="0"/>
+  <w15:commentEx w15:paraId="3594B296" w15:done="0"/>
+  <w15:commentEx w15:paraId="663807A0" w15:done="0"/>
+  <w15:commentEx w15:paraId="64CC8198" w15:done="0"/>
+</w15:commentsEx>
+</file>
+
+<file path=word/commentsExtensible.xml><?xml version="1.0" encoding="utf-8"?>
+<w16cex:commentsExtensible xmlns:wpc="http://schemas.microsoft.com/office/word/2010/wordprocessingCanvas" xmlns:cx="http://schemas.microsoft.com/office/drawing/2014/chartex" xmlns:cx1="http://schemas.microsoft.com/office/drawing/2015/9/8/chartex" xmlns:cx2="http://schemas.microsoft.com/office/drawing/2015/10/21/chartex" xmlns:cx3="http://schemas.microsoft.com/office/drawing/2016/5/9/chartex" xmlns:cx4="http://schemas.microsoft.com/office/drawing/2016/5/10/chartex" xmlns:cx5="http://schemas.microsoft.com/office/drawing/2016/5/11/chartex" xmlns:cx6="http://schemas.microsoft.com/office/drawing/2016/5/12/chartex" xmlns:cx7="http://schemas.microsoft.com/office/drawing/2016/5/13/chartex" xmlns:cx8="http://schemas.microsoft.com/office/drawing/2016/5/14/chartex" xmlns:cr="http://schemas.microsoft.com/office/comments/2020/reactions" xmlns:mc="http://schemas.openxmlformats.org/markup-compatibility/2006" xmlns:aink="http://schemas.microsoft.com/office/drawing/2016/ink" xmlns:am3d="http://schemas.microsoft.com/office/drawing/2017/model3d" xmlns:o="urn:schemas-microsoft-com:office:office" xmlns:oel="http://schemas.microsoft.com/office/2019/extlst" xmlns:r="http://schemas.openxmlformats.org/officeDocument/2006/relationships" xmlns:m="http://schemas.openxmlformats.org/officeDocument/2006/math" xmlns:v="urn:schemas-microsoft-com:vml" xmlns:wp14="http://schemas.microsoft.com/office/word/2010/wordprocessingDrawing" xmlns:wp="http://schemas.openxmlformats.org/drawingml/2006/wordprocessingDrawing" xmlns:w10="urn:schemas-microsoft-com:office:word" xmlns:w="http://schemas.openxmlformats.org/wordprocessingml/2006/main" xmlns:w14="http://schemas.microsoft.com/office/word/2010/wordml" xmlns:w15="http://schemas.microsoft.com/office/word/2012/wordml" xmlns:w16cex="http://schemas.microsoft.com/office/word/2018/wordml/cex" xmlns:w16cid="http://schemas.microsoft.com/office/word/2016/wordml/cid" xmlns:w16="http://schemas.microsoft.com/office/word/2018/wordml" xmlns:w16du="http://schemas.microsoft.com/office/word/2023/wordml/word16du" xmlns:w16sdtdh="http://schemas.microsoft.com/office/word/2020/wordml/sdtdatahash" xmlns:w16sdtfl="http://schemas.microsoft.com/office/word/2024/wordml/sdtformatlock" xmlns:w16se="http://schemas.microsoft.com/office/word/2015/wordml/symex" xmlns:wpg="http://schemas.microsoft.com/office/word/2010/wordprocessingGroup" xmlns:wpi="http://schemas.microsoft.com/office/word/2010/wordprocessingInk" xmlns:wne="http://schemas.microsoft.com/office/word/2006/wordml" xmlns:wps="http://schemas.microsoft.com/office/word/2010/wordprocessingShape" mc:Ignorable="w14 w15 w16se w16cid w16 w16cex w16sdtdh w16sdtfl cr w16du wp14">
+  <w16cex:commentExtensible w16cex:durableId="4ADE35FF" w16cex:dateUtc="2025-12-25T12:08:00Z"/>
+  <w16cex:commentExtensible w16cex:durableId="4ED9BF54" w16cex:dateUtc="2025-12-25T11:07:00Z"/>
+  <w16cex:commentExtensible w16cex:durableId="336EDF58" w16cex:dateUtc="2025-12-25T11:13:00Z"/>
+  <w16cex:commentExtensible w16cex:durableId="0435757D" w16cex:dateUtc="2025-12-25T11:17:00Z"/>
+</w16cex:commentsExtensible>
+</file>
+
+<file path=word/commentsIds.xml><?xml version="1.0" encoding="utf-8"?>
+<w16cid:commentsIds xmlns:wpc="http://schemas.microsoft.com/office/word/2010/wordprocessingCanvas" xmlns:cx="http://schemas.microsoft.com/office/drawing/2014/chartex" xmlns:cx1="http://schemas.microsoft.com/office/drawing/2015/9/8/chartex" xmlns:cx2="http://schemas.microsoft.com/office/drawing/2015/10/21/chartex" xmlns:cx3="http://schemas.microsoft.com/office/drawing/2016/5/9/chartex" xmlns:cx4="http://schemas.microsoft.com/office/drawing/2016/5/10/chartex" xmlns:cx5="http://schemas.microsoft.com/office/drawing/2016/5/11/chartex" xmlns:cx6="http://schemas.microsoft.com/office/drawing/2016/5/12/chartex" xmlns:cx7="http://schemas.microsoft.com/office/drawing/2016/5/13/chartex" xmlns:cx8="http://schemas.microsoft.com/office/drawing/2016/5/14/chartex" xmlns:mc="http://schemas.openxmlformats.org/markup-compatibility/2006" xmlns:aink="http://schemas.microsoft.com/office/drawing/2016/ink" xmlns:am3d="http://schemas.microsoft.com/office/drawing/2017/model3d" xmlns:o="urn:schemas-microsoft-com:office:office" xmlns:oel="http://schemas.microsoft.com/office/2019/extlst" xmlns:r="http://schemas.openxmlformats.org/officeDocument/2006/relationships" xmlns:m="http://schemas.openxmlformats.org/officeDocument/2006/math" xmlns:v="urn:schemas-microsoft-com:vml" xmlns:wp14="http://schemas.microsoft.com/office/word/2010/wordprocessingDrawing" xmlns:wp="http://schemas.openxmlformats.org/drawingml/2006/wordprocessingDrawing" xmlns:w10="urn:schemas-microsoft-com:office:word" xmlns:w="http://schemas.openxmlformats.org/wordprocessingml/2006/main" xmlns:w14="http://schemas.microsoft.com/office/word/2010/wordml" xmlns:w15="http://schemas.microsoft.com/office/word/2012/wordml" xmlns:w16cex="http://schemas.microsoft.com/office/word/2018/wordml/cex" xmlns:w16cid="http://schemas.microsoft.com/office/word/2016/wordml/cid" xmlns:w16="http://schemas.microsoft.com/office/word/2018/wordml" xmlns:w16du="http://schemas.microsoft.com/office/word/2023/wordml/word16du" xmlns:w16sdtdh="http://schemas.microsoft.com/office/word/2020/wordml/sdtdatahash" xmlns:w16sdtfl="http://schemas.microsoft.com/office/word/2024/wordml/sdtformatlock" xmlns:w16se="http://schemas.microsoft.com/office/word/2015/wordml/symex" xmlns:wpg="http://schemas.microsoft.com/office/word/2010/wordprocessingGroup" xmlns:wpi="http://schemas.microsoft.com/office/word/2010/wordprocessingInk" xmlns:wne="http://schemas.microsoft.com/office/word/2006/wordml" xmlns:wps="http://schemas.microsoft.com/office/word/2010/wordprocessingShape" mc:Ignorable="w14 w15 w16se w16cid w16 w16cex w16sdtdh w16sdtfl w16du wp14">
+  <w16cid:commentId w16cid:paraId="590A92B5" w16cid:durableId="4ADE35FF"/>
+  <w16cid:commentId w16cid:paraId="3594B296" w16cid:durableId="4ED9BF54"/>
+  <w16cid:commentId w16cid:paraId="663807A0" w16cid:durableId="336EDF58"/>
+  <w16cid:commentId w16cid:paraId="64CC8198" w16cid:durableId="0435757D"/>
+</w16cid:commentsIds>
 </file>
 
 <file path=word/numbering.xml><?xml version="1.0" encoding="utf-8"?>
@@ -30153,6 +30327,14 @@
     <w:abstractNumId w:val="1"/>
   </w:num>
 </w:numbering>
+</file>
+
+<file path=word/people.xml><?xml version="1.0" encoding="utf-8"?>
+<w15:people xmlns:wpc="http://schemas.microsoft.com/office/word/2010/wordprocessingCanvas" xmlns:cx="http://schemas.microsoft.com/office/drawing/2014/chartex" xmlns:cx1="http://schemas.microsoft.com/office/drawing/2015/9/8/chartex" xmlns:cx2="http://schemas.microsoft.com/office/drawing/2015/10/21/chartex" xmlns:cx3="http://schemas.microsoft.com/office/drawing/2016/5/9/chartex" xmlns:cx4="http://schemas.microsoft.com/office/drawing/2016/5/10/chartex" xmlns:cx5="http://schemas.microsoft.com/office/drawing/2016/5/11/chartex" xmlns:cx6="http://schemas.microsoft.com/office/drawing/2016/5/12/chartex" xmlns:cx7="http://schemas.microsoft.com/office/drawing/2016/5/13/chartex" xmlns:cx8="http://schemas.microsoft.com/office/drawing/2016/5/14/chartex" xmlns:mc="http://schemas.openxmlformats.org/markup-compatibility/2006" xmlns:aink="http://schemas.microsoft.com/office/drawing/2016/ink" xmlns:am3d="http://schemas.microsoft.com/office/drawing/2017/model3d" xmlns:o="urn:schemas-microsoft-com:office:office" xmlns:oel="http://schemas.microsoft.com/office/2019/extlst" xmlns:r="http://schemas.openxmlformats.org/officeDocument/2006/relationships" xmlns:m="http://schemas.openxmlformats.org/officeDocument/2006/math" xmlns:v="urn:schemas-microsoft-com:vml" xmlns:wp14="http://schemas.microsoft.com/office/word/2010/wordprocessingDrawing" xmlns:wp="http://schemas.openxmlformats.org/drawingml/2006/wordprocessingDrawing" xmlns:w10="urn:schemas-microsoft-com:office:word" xmlns:w="http://schemas.openxmlformats.org/wordprocessingml/2006/main" xmlns:w14="http://schemas.microsoft.com/office/word/2010/wordml" xmlns:w15="http://schemas.microsoft.com/office/word/2012/wordml" xmlns:w16cex="http://schemas.microsoft.com/office/word/2018/wordml/cex" xmlns:w16cid="http://schemas.microsoft.com/office/word/2016/wordml/cid" xmlns:w16="http://schemas.microsoft.com/office/word/2018/wordml" xmlns:w16du="http://schemas.microsoft.com/office/word/2023/wordml/word16du" xmlns:w16sdtdh="http://schemas.microsoft.com/office/word/2020/wordml/sdtdatahash" xmlns:w16sdtfl="http://schemas.microsoft.com/office/word/2024/wordml/sdtformatlock" xmlns:w16se="http://schemas.microsoft.com/office/word/2015/wordml/symex" xmlns:wpg="http://schemas.microsoft.com/office/word/2010/wordprocessingGroup" xmlns:wpi="http://schemas.microsoft.com/office/word/2010/wordprocessingInk" xmlns:wne="http://schemas.microsoft.com/office/word/2006/wordml" xmlns:wps="http://schemas.microsoft.com/office/word/2010/wordprocessingShape" mc:Ignorable="w14 w15 w16se w16cid w16 w16cex w16sdtdh w16sdtfl w16du wp14">
+  <w15:person w15:author="YouQuan Neu (yqn1e23)">
+    <w15:presenceInfo w15:providerId="AD" w15:userId="S::yqn1e23@soton.ac.uk::0c021fe7-723c-4578-a5e3-3504bb6977fa"/>
+  </w15:person>
+</w15:people>
 </file>
 
 <file path=word/styles.xml><?xml version="1.0" encoding="utf-8"?>
@@ -30756,7 +30938,6 @@
   <w:style w:type="character" w:default="1" w:styleId="DefaultParagraphFont">
     <w:name w:val="Default Paragraph Font"/>
     <w:uiPriority w:val="1"/>
-    <w:semiHidden/>
     <w:unhideWhenUsed/>
   </w:style>
   <w:style w:type="table" w:default="1" w:styleId="TableNormal">
@@ -31165,6 +31346,72 @@
       <w:ind w:left="240"/>
     </w:pPr>
   </w:style>
+  <w:style w:type="character" w:styleId="CommentReference">
+    <w:name w:val="annotation reference"/>
+    <w:basedOn w:val="DefaultParagraphFont"/>
+    <w:uiPriority w:val="99"/>
+    <w:semiHidden/>
+    <w:unhideWhenUsed/>
+    <w:rsid w:val="00F11BDB"/>
+    <w:rPr>
+      <w:sz w:val="16"/>
+      <w:szCs w:val="16"/>
+    </w:rPr>
+  </w:style>
+  <w:style w:type="paragraph" w:styleId="CommentText">
+    <w:name w:val="annotation text"/>
+    <w:basedOn w:val="Normal"/>
+    <w:link w:val="CommentTextChar"/>
+    <w:uiPriority w:val="99"/>
+    <w:unhideWhenUsed/>
+    <w:rsid w:val="00F11BDB"/>
+    <w:pPr>
+      <w:spacing w:line="240" w:lineRule="auto"/>
+    </w:pPr>
+    <w:rPr>
+      <w:sz w:val="20"/>
+      <w:szCs w:val="20"/>
+    </w:rPr>
+  </w:style>
+  <w:style w:type="character" w:customStyle="1" w:styleId="CommentTextChar">
+    <w:name w:val="Comment Text Char"/>
+    <w:basedOn w:val="DefaultParagraphFont"/>
+    <w:link w:val="CommentText"/>
+    <w:uiPriority w:val="99"/>
+    <w:rsid w:val="00F11BDB"/>
+    <w:rPr>
+      <w:sz w:val="20"/>
+      <w:szCs w:val="20"/>
+    </w:rPr>
+  </w:style>
+  <w:style w:type="paragraph" w:styleId="CommentSubject">
+    <w:name w:val="annotation subject"/>
+    <w:basedOn w:val="CommentText"/>
+    <w:next w:val="CommentText"/>
+    <w:link w:val="CommentSubjectChar"/>
+    <w:uiPriority w:val="99"/>
+    <w:semiHidden/>
+    <w:unhideWhenUsed/>
+    <w:rsid w:val="00F11BDB"/>
+    <w:rPr>
+      <w:b/>
+      <w:bCs/>
+    </w:rPr>
+  </w:style>
+  <w:style w:type="character" w:customStyle="1" w:styleId="CommentSubjectChar">
+    <w:name w:val="Comment Subject Char"/>
+    <w:basedOn w:val="CommentTextChar"/>
+    <w:link w:val="CommentSubject"/>
+    <w:uiPriority w:val="99"/>
+    <w:semiHidden/>
+    <w:rsid w:val="00F11BDB"/>
+    <w:rPr>
+      <w:b/>
+      <w:bCs/>
+      <w:sz w:val="20"/>
+      <w:szCs w:val="20"/>
+    </w:rPr>
+  </w:style>
 </w:styles>
 </file>
 
@@ -31580,6 +31827,7 @@
     <w:sig w:usb0="00000000" w:usb1="10000000" w:usb2="00000000" w:usb3="00000000" w:csb0="80000000" w:csb1="00000000"/>
   </w:font>
   <w:font w:name="Aptos">
+    <w:altName w:val="Calibri"/>
     <w:charset w:val="00"/>
     <w:family w:val="swiss"/>
     <w:pitch w:val="variable"/>
@@ -31594,6 +31842,7 @@
     <w:sig w:usb0="A00002BF" w:usb1="38CF7CFA" w:usb2="00000016" w:usb3="00000000" w:csb0="0004000F" w:csb1="00000000"/>
   </w:font>
   <w:font w:name="Aptos Display">
+    <w:altName w:val="Calibri"/>
     <w:charset w:val="00"/>
     <w:family w:val="swiss"/>
     <w:pitch w:val="variable"/>
@@ -31647,6 +31896,7 @@
     <w:rsid w:val="004E1A3F"/>
     <w:rsid w:val="004E6FB7"/>
     <w:rsid w:val="005C586A"/>
+    <w:rsid w:val="0062034F"/>
     <w:rsid w:val="00644063"/>
     <w:rsid w:val="00695581"/>
     <w:rsid w:val="006E6F57"/>
@@ -31671,6 +31921,8 @@
     <w:rsid w:val="00D423E8"/>
     <w:rsid w:val="00D60FDD"/>
     <w:rsid w:val="00DC5904"/>
+    <w:rsid w:val="00E4372E"/>
+    <w:rsid w:val="00E6116F"/>
     <w:rsid w:val="00E903D0"/>
     <w:rsid w:val="00EB2EBA"/>
     <w:rsid w:val="00F02A9B"/>

</xml_diff>